<commit_message>
Integrate web development career across portfolio
</commit_message>
<xml_diff>
--- a/public/documents/김건희_이력서.docx
+++ b/public/documents/김건희_이력서.docx
@@ -7,18 +7,15 @@
         <w:pStyle w:val="Title"/>
       </w:pPr>
       <w:r>
-        <w:t>이력서</w:t>
+        <w:t>김건희 이력서</w:t>
       </w:r>
     </w:p>
     <w:p>
-      <w:pPr>
-        <w:spacing w:after="280"/>
-      </w:pPr>
       <w:r>
         <w:rPr>
           <w:b/>
         </w:rPr>
-        <w:t>김건희 · 배운 것을 나누며 끝까지 함께한 사람</w:t>
+        <w:t>웹 서비스 개발 경험을 기록과 협업으로 연결하는 개발자</w:t>
       </w:r>
     </w:p>
     <w:p>
@@ -36,8 +33,8 @@
         <w:tblLook w:firstColumn="1" w:firstRow="1" w:lastColumn="0" w:lastRow="0" w:noHBand="0" w:noVBand="1" w:val="04A0"/>
       </w:tblPr>
       <w:tblGrid>
-        <w:gridCol w:w="1944"/>
-        <w:gridCol w:w="7920"/>
+        <w:gridCol w:w="4968"/>
+        <w:gridCol w:w="4968"/>
       </w:tblGrid>
       <w:tr>
         <w:tc>
@@ -49,8 +46,6 @@
               <w:left w:val="single" w:sz="4" w:color="D9D9D9"/>
               <w:bottom w:val="single" w:sz="4" w:color="D9D9D9"/>
               <w:right w:val="single" w:sz="4" w:color="D9D9D9"/>
-              <w:insideH w:val="single" w:sz="4" w:color="D9D9D9"/>
-              <w:insideV w:val="single" w:sz="4" w:color="D9D9D9"/>
             </w:tcBorders>
             <w:shd w:fill="E5EAE5"/>
           </w:tcPr>
@@ -72,8 +67,6 @@
               <w:left w:val="single" w:sz="4" w:color="D9D9D9"/>
               <w:bottom w:val="single" w:sz="4" w:color="D9D9D9"/>
               <w:right w:val="single" w:sz="4" w:color="D9D9D9"/>
-              <w:insideH w:val="single" w:sz="4" w:color="D9D9D9"/>
-              <w:insideV w:val="single" w:sz="4" w:color="D9D9D9"/>
             </w:tcBorders>
           </w:tcPr>
           <w:p>
@@ -93,8 +86,6 @@
               <w:left w:val="single" w:sz="4" w:color="D9D9D9"/>
               <w:bottom w:val="single" w:sz="4" w:color="D9D9D9"/>
               <w:right w:val="single" w:sz="4" w:color="D9D9D9"/>
-              <w:insideH w:val="single" w:sz="4" w:color="D9D9D9"/>
-              <w:insideV w:val="single" w:sz="4" w:color="D9D9D9"/>
             </w:tcBorders>
             <w:shd w:fill="E5EAE5"/>
           </w:tcPr>
@@ -116,8 +107,6 @@
               <w:left w:val="single" w:sz="4" w:color="D9D9D9"/>
               <w:bottom w:val="single" w:sz="4" w:color="D9D9D9"/>
               <w:right w:val="single" w:sz="4" w:color="D9D9D9"/>
-              <w:insideH w:val="single" w:sz="4" w:color="D9D9D9"/>
-              <w:insideV w:val="single" w:sz="4" w:color="D9D9D9"/>
             </w:tcBorders>
           </w:tcPr>
           <w:p>
@@ -137,8 +126,46 @@
               <w:left w:val="single" w:sz="4" w:color="D9D9D9"/>
               <w:bottom w:val="single" w:sz="4" w:color="D9D9D9"/>
               <w:right w:val="single" w:sz="4" w:color="D9D9D9"/>
-              <w:insideH w:val="single" w:sz="4" w:color="D9D9D9"/>
-              <w:insideV w:val="single" w:sz="4" w:color="D9D9D9"/>
+            </w:tcBorders>
+            <w:shd w:fill="E5EAE5"/>
+          </w:tcPr>
+          <w:p>
+            <w:r>
+              <w:rPr>
+                <w:b/>
+              </w:rPr>
+              <w:t>경력</w:t>
+            </w:r>
+          </w:p>
+        </w:tc>
+        <w:tc>
+          <w:tcPr>
+            <w:tcW w:type="dxa" w:w="4968"/>
+            <w:vAlign w:val="center"/>
+            <w:tcBorders>
+              <w:top w:val="single" w:sz="4" w:color="D9D9D9"/>
+              <w:left w:val="single" w:sz="4" w:color="D9D9D9"/>
+              <w:bottom w:val="single" w:sz="4" w:color="D9D9D9"/>
+              <w:right w:val="single" w:sz="4" w:color="D9D9D9"/>
+            </w:tcBorders>
+          </w:tcPr>
+          <w:p>
+            <w:r>
+              <w:t>웹개발 2년 5개월</w:t>
+            </w:r>
+          </w:p>
+        </w:tc>
+      </w:tr>
+      <w:tr>
+        <w:tc>
+          <w:tcPr>
+            <w:tcW w:type="dxa" w:w="4968"/>
+            <w:vAlign w:val="center"/>
+            <w:tcBorders>
+              <w:top w:val="single" w:sz="4" w:color="D9D9D9"/>
+              <w:left w:val="single" w:sz="4" w:color="D9D9D9"/>
+              <w:bottom w:val="single" w:sz="4" w:color="D9D9D9"/>
+              <w:right w:val="single" w:sz="4" w:color="D9D9D9"/>
             </w:tcBorders>
             <w:shd w:fill="E5EAE5"/>
           </w:tcPr>
@@ -160,57 +187,11 @@
               <w:left w:val="single" w:sz="4" w:color="D9D9D9"/>
               <w:bottom w:val="single" w:sz="4" w:color="D9D9D9"/>
               <w:right w:val="single" w:sz="4" w:color="D9D9D9"/>
-              <w:insideH w:val="single" w:sz="4" w:color="D9D9D9"/>
-              <w:insideV w:val="single" w:sz="4" w:color="D9D9D9"/>
             </w:tcBorders>
           </w:tcPr>
           <w:p>
             <w:r>
               <w:t>전자정보통신공학</w:t>
-            </w:r>
-          </w:p>
-        </w:tc>
-      </w:tr>
-      <w:tr>
-        <w:tc>
-          <w:tcPr>
-            <w:tcW w:type="dxa" w:w="4968"/>
-            <w:vAlign w:val="center"/>
-            <w:tcBorders>
-              <w:top w:val="single" w:sz="4" w:color="D9D9D9"/>
-              <w:left w:val="single" w:sz="4" w:color="D9D9D9"/>
-              <w:bottom w:val="single" w:sz="4" w:color="D9D9D9"/>
-              <w:right w:val="single" w:sz="4" w:color="D9D9D9"/>
-              <w:insideH w:val="single" w:sz="4" w:color="D9D9D9"/>
-              <w:insideV w:val="single" w:sz="4" w:color="D9D9D9"/>
-            </w:tcBorders>
-            <w:shd w:fill="E5EAE5"/>
-          </w:tcPr>
-          <w:p>
-            <w:r>
-              <w:rPr>
-                <w:b/>
-              </w:rPr>
-              <w:t>관심 분야</w:t>
-            </w:r>
-          </w:p>
-        </w:tc>
-        <w:tc>
-          <w:tcPr>
-            <w:tcW w:type="dxa" w:w="4968"/>
-            <w:vAlign w:val="center"/>
-            <w:tcBorders>
-              <w:top w:val="single" w:sz="4" w:color="D9D9D9"/>
-              <w:left w:val="single" w:sz="4" w:color="D9D9D9"/>
-              <w:bottom w:val="single" w:sz="4" w:color="D9D9D9"/>
-              <w:right w:val="single" w:sz="4" w:color="D9D9D9"/>
-              <w:insideH w:val="single" w:sz="4" w:color="D9D9D9"/>
-              <w:insideV w:val="single" w:sz="4" w:color="D9D9D9"/>
-            </w:tcBorders>
-          </w:tcPr>
-          <w:p>
-            <w:r>
-              <w:t>네트워크·보안·컴퓨터 비전</w:t>
             </w:r>
           </w:p>
         </w:tc>
@@ -222,12 +203,25 @@
         <w:pStyle w:val="Heading1"/>
       </w:pPr>
       <w:r>
-        <w:t>소개</w:t>
+        <w:t>경력</w:t>
+      </w:r>
+    </w:p>
+    <w:p>
+      <w:pPr>
+        <w:pStyle w:val="Heading2"/>
+      </w:pPr>
+      <w:r>
+        <w:t>스타 법무법인</w:t>
       </w:r>
     </w:p>
     <w:p>
       <w:r>
-        <w:t>전자정보통신공학 전공에서 통신·네트워크를 배우고, 2026년에 이를 심화 실습했습니다. 실패한 실습을 다시 시작하고, 이해한 내용을 동료와 나누며 함께 해결하는 방식으로 성장해 왔습니다.</w:t>
+        <w:t>전략기획본부 · 주임/팀원 · 웹개발 | 2023.02~2025.06</w:t>
+      </w:r>
+    </w:p>
+    <w:p>
+      <w:r>
+        <w:t>단독 프론트엔드 개발을 중심으로 사내 통계 대시보드, 홈페이지 리뉴얼, 신규 플랫폼과 콘텐츠 관리 사이트를 개발하고 Resource Name System의 백엔드 데이터 구조 설계에 참여했습니다.</w:t>
       </w:r>
     </w:p>
     <w:p>
@@ -235,277 +229,7 @@
         <w:pStyle w:val="Heading1"/>
       </w:pPr>
       <w:r>
-        <w:t>대표 경험</w:t>
-      </w:r>
-    </w:p>
-    <w:tbl>
-      <w:tblPr>
-        <w:tblW w:type="auto" w:w="0"/>
-        <w:tblLook w:firstColumn="1" w:firstRow="1" w:lastColumn="0" w:lastRow="0" w:noHBand="0" w:noVBand="1" w:val="04A0"/>
-      </w:tblPr>
-      <w:tblGrid>
-        <w:gridCol w:w="3312"/>
-        <w:gridCol w:w="3312"/>
-        <w:gridCol w:w="3312"/>
-      </w:tblGrid>
-      <w:tr>
-        <w:tc>
-          <w:tcPr>
-            <w:tcW w:type="dxa" w:w="3312"/>
-            <w:shd w:fill="243E35"/>
-            <w:tcBorders>
-              <w:top w:val="single" w:sz="4" w:color="D9D9D9"/>
-              <w:left w:val="single" w:sz="4" w:color="D9D9D9"/>
-              <w:bottom w:val="single" w:sz="4" w:color="D9D9D9"/>
-              <w:right w:val="single" w:sz="4" w:color="D9D9D9"/>
-              <w:insideH w:val="single" w:sz="4" w:color="D9D9D9"/>
-              <w:insideV w:val="single" w:sz="4" w:color="D9D9D9"/>
-            </w:tcBorders>
-          </w:tcPr>
-          <w:p>
-            <w:r>
-              <w:rPr>
-                <w:b/>
-                <w:color w:val="FFFFFF"/>
-              </w:rPr>
-              <w:t>시기</w:t>
-            </w:r>
-          </w:p>
-        </w:tc>
-        <w:tc>
-          <w:tcPr>
-            <w:tcW w:type="dxa" w:w="3312"/>
-            <w:shd w:fill="243E35"/>
-            <w:tcBorders>
-              <w:top w:val="single" w:sz="4" w:color="D9D9D9"/>
-              <w:left w:val="single" w:sz="4" w:color="D9D9D9"/>
-              <w:bottom w:val="single" w:sz="4" w:color="D9D9D9"/>
-              <w:right w:val="single" w:sz="4" w:color="D9D9D9"/>
-              <w:insideH w:val="single" w:sz="4" w:color="D9D9D9"/>
-              <w:insideV w:val="single" w:sz="4" w:color="D9D9D9"/>
-            </w:tcBorders>
-          </w:tcPr>
-          <w:p>
-            <w:r>
-              <w:rPr>
-                <w:b/>
-                <w:color w:val="FFFFFF"/>
-              </w:rPr>
-              <w:t>프로젝트</w:t>
-            </w:r>
-          </w:p>
-        </w:tc>
-        <w:tc>
-          <w:tcPr>
-            <w:tcW w:type="dxa" w:w="3312"/>
-            <w:shd w:fill="243E35"/>
-            <w:tcBorders>
-              <w:top w:val="single" w:sz="4" w:color="D9D9D9"/>
-              <w:left w:val="single" w:sz="4" w:color="D9D9D9"/>
-              <w:bottom w:val="single" w:sz="4" w:color="D9D9D9"/>
-              <w:right w:val="single" w:sz="4" w:color="D9D9D9"/>
-              <w:insideH w:val="single" w:sz="4" w:color="D9D9D9"/>
-              <w:insideV w:val="single" w:sz="4" w:color="D9D9D9"/>
-            </w:tcBorders>
-          </w:tcPr>
-          <w:p>
-            <w:r>
-              <w:rPr>
-                <w:b/>
-                <w:color w:val="FFFFFF"/>
-              </w:rPr>
-              <w:t>역할·결과</w:t>
-            </w:r>
-          </w:p>
-        </w:tc>
-      </w:tr>
-      <w:tr>
-        <w:tc>
-          <w:tcPr>
-            <w:tcW w:type="dxa" w:w="3312"/>
-            <w:tcBorders>
-              <w:top w:val="single" w:sz="4" w:color="D9D9D9"/>
-              <w:left w:val="single" w:sz="4" w:color="D9D9D9"/>
-              <w:bottom w:val="single" w:sz="4" w:color="D9D9D9"/>
-              <w:right w:val="single" w:sz="4" w:color="D9D9D9"/>
-              <w:insideH w:val="single" w:sz="4" w:color="D9D9D9"/>
-              <w:insideV w:val="single" w:sz="4" w:color="D9D9D9"/>
-            </w:tcBorders>
-            <w:vAlign w:val="center"/>
-          </w:tcPr>
-          <w:p>
-            <w:r>
-              <w:t>2018</w:t>
-            </w:r>
-          </w:p>
-        </w:tc>
-        <w:tc>
-          <w:tcPr>
-            <w:tcW w:type="dxa" w:w="3312"/>
-            <w:tcBorders>
-              <w:top w:val="single" w:sz="4" w:color="D9D9D9"/>
-              <w:left w:val="single" w:sz="4" w:color="D9D9D9"/>
-              <w:bottom w:val="single" w:sz="4" w:color="D9D9D9"/>
-              <w:right w:val="single" w:sz="4" w:color="D9D9D9"/>
-              <w:insideH w:val="single" w:sz="4" w:color="D9D9D9"/>
-              <w:insideV w:val="single" w:sz="4" w:color="D9D9D9"/>
-            </w:tcBorders>
-            <w:vAlign w:val="center"/>
-          </w:tcPr>
-          <w:p>
-            <w:r>
-              <w:t>스마트 미러 졸업과제</w:t>
-            </w:r>
-          </w:p>
-        </w:tc>
-        <w:tc>
-          <w:tcPr>
-            <w:tcW w:type="dxa" w:w="3312"/>
-            <w:tcBorders>
-              <w:top w:val="single" w:sz="4" w:color="D9D9D9"/>
-              <w:left w:val="single" w:sz="4" w:color="D9D9D9"/>
-              <w:bottom w:val="single" w:sz="4" w:color="D9D9D9"/>
-              <w:right w:val="single" w:sz="4" w:color="D9D9D9"/>
-              <w:insideH w:val="single" w:sz="4" w:color="D9D9D9"/>
-              <w:insideV w:val="single" w:sz="4" w:color="D9D9D9"/>
-            </w:tcBorders>
-            <w:vAlign w:val="center"/>
-          </w:tcPr>
-          <w:p>
-            <w:r>
-              <w:t>팀 구성 변화 뒤 역할과 일정을 재조정하고 필수 기능부터 완성</w:t>
-            </w:r>
-          </w:p>
-        </w:tc>
-      </w:tr>
-      <w:tr>
-        <w:tc>
-          <w:tcPr>
-            <w:tcW w:type="dxa" w:w="3312"/>
-            <w:tcBorders>
-              <w:top w:val="single" w:sz="4" w:color="D9D9D9"/>
-              <w:left w:val="single" w:sz="4" w:color="D9D9D9"/>
-              <w:bottom w:val="single" w:sz="4" w:color="D9D9D9"/>
-              <w:right w:val="single" w:sz="4" w:color="D9D9D9"/>
-              <w:insideH w:val="single" w:sz="4" w:color="D9D9D9"/>
-              <w:insideV w:val="single" w:sz="4" w:color="D9D9D9"/>
-            </w:tcBorders>
-            <w:vAlign w:val="center"/>
-            <w:shd w:fill="F2F5F2"/>
-          </w:tcPr>
-          <w:p>
-            <w:r>
-              <w:t>2026</w:t>
-            </w:r>
-          </w:p>
-        </w:tc>
-        <w:tc>
-          <w:tcPr>
-            <w:tcW w:type="dxa" w:w="3312"/>
-            <w:tcBorders>
-              <w:top w:val="single" w:sz="4" w:color="D9D9D9"/>
-              <w:left w:val="single" w:sz="4" w:color="D9D9D9"/>
-              <w:bottom w:val="single" w:sz="4" w:color="D9D9D9"/>
-              <w:right w:val="single" w:sz="4" w:color="D9D9D9"/>
-              <w:insideH w:val="single" w:sz="4" w:color="D9D9D9"/>
-              <w:insideV w:val="single" w:sz="4" w:color="D9D9D9"/>
-            </w:tcBorders>
-            <w:vAlign w:val="center"/>
-            <w:shd w:fill="F2F5F2"/>
-          </w:tcPr>
-          <w:p>
-            <w:r>
-              <w:t>네트워크·보안 심화 실습</w:t>
-            </w:r>
-          </w:p>
-        </w:tc>
-        <w:tc>
-          <w:tcPr>
-            <w:tcW w:type="dxa" w:w="3312"/>
-            <w:tcBorders>
-              <w:top w:val="single" w:sz="4" w:color="D9D9D9"/>
-              <w:left w:val="single" w:sz="4" w:color="D9D9D9"/>
-              <w:bottom w:val="single" w:sz="4" w:color="D9D9D9"/>
-              <w:right w:val="single" w:sz="4" w:color="D9D9D9"/>
-              <w:insideH w:val="single" w:sz="4" w:color="D9D9D9"/>
-              <w:insideV w:val="single" w:sz="4" w:color="D9D9D9"/>
-            </w:tcBorders>
-            <w:vAlign w:val="center"/>
-            <w:shd w:fill="F2F5F2"/>
-          </w:tcPr>
-          <w:p>
-            <w:r>
-              <w:t>실습 재시도, 개념 설명, 공동 확인으로 학습과 협업 지속</w:t>
-            </w:r>
-          </w:p>
-        </w:tc>
-      </w:tr>
-      <w:tr>
-        <w:tc>
-          <w:tcPr>
-            <w:tcW w:type="dxa" w:w="3312"/>
-            <w:tcBorders>
-              <w:top w:val="single" w:sz="4" w:color="D9D9D9"/>
-              <w:left w:val="single" w:sz="4" w:color="D9D9D9"/>
-              <w:bottom w:val="single" w:sz="4" w:color="D9D9D9"/>
-              <w:right w:val="single" w:sz="4" w:color="D9D9D9"/>
-              <w:insideH w:val="single" w:sz="4" w:color="D9D9D9"/>
-              <w:insideV w:val="single" w:sz="4" w:color="D9D9D9"/>
-            </w:tcBorders>
-            <w:vAlign w:val="center"/>
-          </w:tcPr>
-          <w:p>
-            <w:r>
-              <w:t>2026</w:t>
-            </w:r>
-          </w:p>
-        </w:tc>
-        <w:tc>
-          <w:tcPr>
-            <w:tcW w:type="dxa" w:w="3312"/>
-            <w:tcBorders>
-              <w:top w:val="single" w:sz="4" w:color="D9D9D9"/>
-              <w:left w:val="single" w:sz="4" w:color="D9D9D9"/>
-              <w:bottom w:val="single" w:sz="4" w:color="D9D9D9"/>
-              <w:right w:val="single" w:sz="4" w:color="D9D9D9"/>
-              <w:insideH w:val="single" w:sz="4" w:color="D9D9D9"/>
-              <w:insideV w:val="single" w:sz="4" w:color="D9D9D9"/>
-            </w:tcBorders>
-            <w:vAlign w:val="center"/>
-          </w:tcPr>
-          <w:p>
-            <w:r>
-              <w:t>국내 알약 식별 연구 초안</w:t>
-            </w:r>
-          </w:p>
-        </w:tc>
-        <w:tc>
-          <w:tcPr>
-            <w:tcW w:type="dxa" w:w="3312"/>
-            <w:tcBorders>
-              <w:top w:val="single" w:sz="4" w:color="D9D9D9"/>
-              <w:left w:val="single" w:sz="4" w:color="D9D9D9"/>
-              <w:bottom w:val="single" w:sz="4" w:color="D9D9D9"/>
-              <w:right w:val="single" w:sz="4" w:color="D9D9D9"/>
-              <w:insideH w:val="single" w:sz="4" w:color="D9D9D9"/>
-              <w:insideV w:val="single" w:sz="4" w:color="D9D9D9"/>
-            </w:tcBorders>
-            <w:vAlign w:val="center"/>
-          </w:tcPr>
-          <w:p>
-            <w:r>
-              <w:t>OpenCV·비전 LLM 비교 설계, 국내 기준자료와 평가 절차 정리</w:t>
-            </w:r>
-          </w:p>
-        </w:tc>
-      </w:tr>
-    </w:tbl>
-    <w:p>
-      <w:pPr>
-        <w:pStyle w:val="Heading1"/>
-      </w:pPr>
-      <w:r>
-        <w:t>강점</w:t>
+        <w:t>기술</w:t>
       </w:r>
     </w:p>
     <w:p>
@@ -513,10 +237,10 @@
         <w:rPr>
           <w:b/>
         </w:rPr>
-        <w:t xml:space="preserve">자기조절력 · </w:t>
+        <w:t xml:space="preserve">개발  </w:t>
       </w:r>
       <w:r>
-        <w:t>상황이 바뀌면 우선순위와 실행 순서를 다시 세웁니다.</w:t>
+        <w:t>TypeScript, Next.js, React, Recoil, PostgreSQL, CSS, MUI, AWS, Docker, QGIS</w:t>
       </w:r>
     </w:p>
     <w:p>
@@ -524,10 +248,10 @@
         <w:rPr>
           <w:b/>
         </w:rPr>
-        <w:t xml:space="preserve">대인관계력 · </w:t>
+        <w:t xml:space="preserve">협업  </w:t>
       </w:r>
       <w:r>
-        <w:t>질문을 끝까지 듣고 핵심을 정리해 함께 해결합니다.</w:t>
+        <w:t>Git, Notion, Figma, Slack</w:t>
       </w:r>
     </w:p>
     <w:p>
@@ -535,20 +259,92 @@
         <w:rPr>
           <w:b/>
         </w:rPr>
-        <w:t xml:space="preserve">자기동기력 · </w:t>
+        <w:t xml:space="preserve">기반  </w:t>
       </w:r>
       <w:r>
-        <w:t>실패한 실습도 원인을 돌아보고 다시 시작합니다.</w:t>
+        <w:t>통신·네트워크, 정보보안 개념</w:t>
+      </w:r>
+    </w:p>
+    <w:p>
+      <w:pPr>
+        <w:pStyle w:val="Heading1"/>
+      </w:pPr>
+      <w:r>
+        <w:t>주요 성과</w:t>
+      </w:r>
+    </w:p>
+    <w:p>
+      <w:pPr>
+        <w:pStyle w:val="ListBullet"/>
+      </w:pPr>
+      <w:r>
+        <w:t>사내 통계 집계 자동화로 보고 작업 시간 약 3시간 단축</w:t>
+      </w:r>
+    </w:p>
+    <w:p>
+      <w:pPr>
+        <w:pStyle w:val="ListBullet"/>
+      </w:pPr>
+      <w:r>
+        <w:t>콘텐츠 등록 자동화로 제작·등록 시간 약 3시간 단축</w:t>
+      </w:r>
+    </w:p>
+    <w:p>
+      <w:pPr>
+        <w:pStyle w:val="ListBullet"/>
+      </w:pPr>
+      <w:r>
+        <w:t>PHP 기반 레거시 화면을 React로 전환해 유지보수 편의 개선</w:t>
+      </w:r>
+    </w:p>
+    <w:p>
+      <w:pPr>
+        <w:pStyle w:val="ListBullet"/>
+      </w:pPr>
+      <w:r>
+        <w:t>RNS 데이터 구조 설계로 고객 데이터 접근 과정 단순화</w:t>
+      </w:r>
+    </w:p>
+    <w:p>
+      <w:pPr>
+        <w:pStyle w:val="Heading1"/>
+      </w:pPr>
+      <w:r>
+        <w:t>추가 프로젝트</w:t>
+      </w:r>
+    </w:p>
+    <w:p>
+      <w:pPr>
+        <w:pStyle w:val="ListBullet"/>
+      </w:pPr>
+      <w:r>
+        <w:t>2018 스마트 미러 졸업과제 · 팀 구성 변화 뒤 필수 기능을 우선해 마무리</w:t>
+      </w:r>
+    </w:p>
+    <w:p>
+      <w:pPr>
+        <w:pStyle w:val="ListBullet"/>
+      </w:pPr>
+      <w:r>
+        <w:t>2026 네트워크·보안 심화 실습 · 재시도와 동료 협업으로 학습 지속</w:t>
+      </w:r>
+    </w:p>
+    <w:p>
+      <w:pPr>
+        <w:pStyle w:val="ListBullet"/>
+      </w:pPr>
+      <w:r>
+        <w:t>2026 국내 알약 식별 연구 초안 · OpenCV와 비전 LLM 비교 평가 설계</w:t>
       </w:r>
     </w:p>
     <w:p>
       <w:r>
-        <w:t>학교명·학위명·전체 수행기간은 확인되지 않아 임의로 적지 않았습니다.</w:t>
+        <w:t>회사 경력은 2026-10-14 사용자가 직접 제공한 내용을 기준으로 작성했습니다.</w:t>
       </w:r>
     </w:p>
     <w:sectPr>
       <w:pgSz w:w="12240" w:h="15840"/>
-      <w:pgMar w:top="1037" w:right="1152" w:bottom="1037" w:left="1152" w:header="720" w:footer="720" w:gutter="0"/>
+      <w:pgMar w:top="1008" w:right="1152" w:bottom="1008" w:left="1152" w:header="720" w:footer="720" w:gutter="0"/>
       <w:cols w:space="720"/>
       <w:docGrid w:linePitch="360"/>
     </w:sectPr>
@@ -920,7 +716,7 @@
     <w:qFormat/>
     <w:rsid w:val="00FC693F"/>
     <w:pPr>
-      <w:spacing w:after="140" w:line="307" w:lineRule="auto"/>
+      <w:spacing w:after="120" w:line="293" w:lineRule="auto"/>
     </w:pPr>
     <w:rPr>
       <w:rFonts w:ascii="Malgun Gothic" w:hAnsi="Malgun Gothic" w:eastAsia="맑은 고딕"/>
@@ -991,7 +787,7 @@
       <w:b/>
       <w:bCs/>
       <w:color w:val="000000"/>
-      <w:sz w:val="34"/>
+      <w:sz w:val="32"/>
       <w:szCs w:val="28"/>
     </w:rPr>
   </w:style>
@@ -1015,7 +811,7 @@
       <w:b/>
       <w:bCs/>
       <w:color w:val="000000"/>
-      <w:sz w:val="26"/>
+      <w:sz w:val="25"/>
       <w:szCs w:val="26"/>
     </w:rPr>
   </w:style>
@@ -1269,6 +1065,7 @@
     <w:qFormat/>
     <w:rsid w:val="00FC693F"/>
     <w:pPr>
+      <w:keepNext/>
       <w:pBdr>
         <w:bottom w:val="single" w:sz="8" w:space="4" w:color="4F81BD" w:themeColor="accent1"/>
       </w:pBdr>
@@ -1281,7 +1078,7 @@
       <w:color w:val="000000"/>
       <w:spacing w:val="5"/>
       <w:kern w:val="28"/>
-      <w:sz w:val="56"/>
+      <w:sz w:val="54"/>
       <w:szCs w:val="52"/>
     </w:rPr>
   </w:style>

</xml_diff>